<commit_message>
fix: mira, que pongo las replicas a mano y me la pela
</commit_message>
<xml_diff>
--- a/documentation/AUTOMATIZACIÓN Y DESPLIEGUE DE UNA APLICACIÓN WEB CON KUBERNETES.docx
+++ b/documentation/AUTOMATIZACIÓN Y DESPLIEGUE DE UNA APLICACIÓN WEB CON KUBERNETES.docx
@@ -20570,7 +20570,35 @@
       </w:r>
       <w:proofErr w:type="spellEnd"/>
       <w:r>
-        <w:t xml:space="preserve"> para el master, que será nuestro reverse proxy. Además, al final, comprueba que el </w:t>
+        <w:t xml:space="preserve"> para el master, que será nuestro reverse proxy.</w:t>
+      </w:r>
+      <w:r>
+        <w:t xml:space="preserve"> También instala la dependencia de </w:t>
+      </w:r>
+      <w:proofErr w:type="spellStart"/>
+      <w:r>
+        <w:t>Kubernetes</w:t>
+      </w:r>
+      <w:proofErr w:type="spellEnd"/>
+      <w:r>
+        <w:t xml:space="preserve"> en Python.</w:t>
+      </w:r>
+      <w:r>
+        <w:t xml:space="preserve"> Además, al final, comprueba que </w:t>
+      </w:r>
+      <w:r>
+        <w:t xml:space="preserve">hay </w:t>
+      </w:r>
+      <w:proofErr w:type="spellStart"/>
+      <w:r>
+        <w:t>kubeconfig</w:t>
+      </w:r>
+      <w:proofErr w:type="spellEnd"/>
+      <w:r>
+        <w:t xml:space="preserve"> y que </w:t>
+      </w:r>
+      <w:r>
+        <w:t xml:space="preserve">el </w:t>
       </w:r>
       <w:proofErr w:type="spellStart"/>
       <w:r>

</xml_diff>